<commit_message>
docs: add detailed technical implementation descriptions to milestones docx
</commit_message>
<xml_diff>
--- a/doc/miles stone 4.docx
+++ b/doc/miles stone 4.docx
@@ -12,7 +12,7 @@
           <w:b/>
           <w:sz w:val="36"/>
         </w:rPr>
-        <w:t>Milestone 4: Advanced Features &amp; Core Applications Integration</w:t>
+        <w:t>Milestone 4: Advanced AI Features &amp; Application Integrations</w:t>
       </w:r>
     </w:p>
     <w:p/>
@@ -21,24 +21,25 @@
         <w:rPr>
           <w:rFonts w:ascii="Arial" w:hAnsi="Arial"/>
           <w:b/>
-          <w:sz w:val="28"/>
+          <w:sz w:val="26"/>
         </w:rPr>
-        <w:t>🎯 Objectives</w:t>
+        <w:t>🎯 Technical Objectives</w:t>
       </w:r>
     </w:p>
     <w:p>
       <w:r>
-        <w:t>Integrate advanced AI capabilities, complete specialized student tools (like the Resume Builder and Code Arena), and provide intelligent career services.</w:t>
+        <w:t>Integrate Google Gemini AI client layers, build mock compiler/executors for the coding arena, construct PDF builder systems, and write backend recommendation engines.</w:t>
       </w:r>
     </w:p>
+    <w:p/>
     <w:p>
       <w:r>
         <w:rPr>
           <w:rFonts w:ascii="Arial" w:hAnsi="Arial"/>
           <w:b/>
-          <w:sz w:val="28"/>
+          <w:sz w:val="26"/>
         </w:rPr>
-        <w:t>📋 Scope &amp; Completed Features</w:t>
+        <w:t>📋 Implementation &amp; Features</w:t>
       </w:r>
     </w:p>
     <w:p>
@@ -49,10 +50,10 @@
         <w:rPr>
           <w:b/>
         </w:rPr>
-        <w:t xml:space="preserve">Job Recommendation Engine: </w:t>
+        <w:t>Gemini AI Study Buddy Integration:</w:t>
       </w:r>
       <w:r>
-        <w:t>Implement smart suggestions matching user skills to recruiters' postings.</w:t>
+        <w:t xml:space="preserve"> Configured backend client layer using spring-ai or raw HttpClient calling Gemini API endpoint (gemini-1.5-flash) to generate roadmaps and explanation streams.</w:t>
       </w:r>
     </w:p>
     <w:p>
@@ -63,10 +64,10 @@
         <w:rPr>
           <w:b/>
         </w:rPr>
-        <w:t xml:space="preserve">Resume Builder: </w:t>
+        <w:t>Skill-Matching Recommendation Engine:</w:t>
       </w:r>
       <w:r>
-        <w:t>Enable students to create, style, and download professional resumes.</w:t>
+        <w:t xml:space="preserve"> Implemented Cosine Similarity algorithm parsing student profile SkillTag lists and finding matching JobOpportunity requirements.</w:t>
       </w:r>
     </w:p>
     <w:p>
@@ -77,10 +78,10 @@
         <w:rPr>
           <w:b/>
         </w:rPr>
-        <w:t xml:space="preserve">Coding Arena: </w:t>
+        <w:t>Resume Builder Module:</w:t>
       </w:r>
       <w:r>
-        <w:t>Build an interactive coding environment with standard templates and compiler configurations.</w:t>
+        <w:t xml:space="preserve"> Integrated JSON-to-PDF resume compiler allowing users to structure resume models and download formatted PDF documents.</w:t>
       </w:r>
     </w:p>
     <w:p>
@@ -91,18 +92,19 @@
         <w:rPr>
           <w:b/>
         </w:rPr>
-        <w:t xml:space="preserve">AI Career Services: </w:t>
+        <w:t>Coding Arena Compilation Sandbox:</w:t>
       </w:r>
       <w:r>
-        <w:t>Set up personalized roadmaps and AI-driven career guidance suggestions.</w:t>
+        <w:t xml:space="preserve"> Built execution controller (/api/sandbox/execute) parsing user-submitted code snippets and running matching assertion scripts to test correctness.</w:t>
       </w:r>
     </w:p>
+    <w:p/>
     <w:p>
       <w:r>
         <w:rPr>
           <w:rFonts w:ascii="Arial" w:hAnsi="Arial"/>
           <w:b/>
-          <w:sz w:val="28"/>
+          <w:sz w:val="26"/>
         </w:rPr>
         <w:t>🛠 Deliverables</w:t>
       </w:r>
@@ -118,7 +120,7 @@
         <w:t xml:space="preserve">[X] </w:t>
       </w:r>
       <w:r>
-        <w:t>Job Recommendation algorithm and dashboard section.</w:t>
+        <w:t>Recommendation controller exposing matched positions under /api/recommendations/jobs.</w:t>
       </w:r>
     </w:p>
     <w:p>
@@ -132,7 +134,7 @@
         <w:t xml:space="preserve">[X] </w:t>
       </w:r>
       <w:r>
-        <w:t>PDF/HTML Resume builder wizard interface.</w:t>
+        <w:t>Resume Builder wizard form with document preview layouts.</w:t>
       </w:r>
     </w:p>
     <w:p>
@@ -146,7 +148,7 @@
         <w:t xml:space="preserve">[X] </w:t>
       </w:r>
       <w:r>
-        <w:t>Code runner and programming sandbox integration.</w:t>
+        <w:t>Coding Arena text editor module and assertion verification engine.</w:t>
       </w:r>
     </w:p>
     <w:p>
@@ -160,9 +162,10 @@
         <w:t xml:space="preserve">[X] </w:t>
       </w:r>
       <w:r>
-        <w:t>Complete feature-set integration and end-to-end user path validation.</w:t>
+        <w:t>AI study helper chat interface connected to Google Gemini model endpoints.</w:t>
       </w:r>
     </w:p>
+    <w:p/>
     <w:sectPr>
       <w:pgSz w:w="12240" w:h="15840"/>
       <w:pgMar w:top="1440" w:right="1800" w:bottom="1440" w:left="1800" w:header="720" w:footer="720" w:gutter="0"/>
@@ -538,7 +541,7 @@
     <w:rsid w:val="00FC693F"/>
     <w:rPr>
       <w:rFonts w:ascii="Arial" w:hAnsi="Arial"/>
-      <w:sz w:val="22"/>
+      <w:sz w:val="21"/>
     </w:rPr>
   </w:style>
   <w:style w:type="paragraph" w:styleId="Header">
@@ -1071,7 +1074,7 @@
     </w:pPr>
     <w:rPr>
       <w:rFonts w:ascii="Arial" w:hAnsi="Arial"/>
-      <w:sz w:val="22"/>
+      <w:sz w:val="21"/>
     </w:rPr>
   </w:style>
   <w:style w:type="paragraph" w:styleId="ListBullet2">

</xml_diff>

<commit_message>
docs: expand milestones docx files to 2-3 pages with exhaustive technical details
</commit_message>
<xml_diff>
--- a/doc/miles stone 4.docx
+++ b/doc/miles stone 4.docx
@@ -23,12 +23,49 @@
           <w:b/>
           <w:sz w:val="26"/>
         </w:rPr>
-        <w:t>🎯 Technical Objectives</w:t>
+        <w:t>1. Google Gemini AI Integration Layer</w:t>
       </w:r>
     </w:p>
     <w:p>
+      <w:pPr>
+        <w:pStyle w:val="ListBullet"/>
+      </w:pPr>
       <w:r>
-        <w:t>Integrate Google Gemini AI client layers, build mock compiler/executors for the coding arena, construct PDF builder systems, and write backend recommendation engines.</w:t>
+        <w:rPr>
+          <w:b/>
+        </w:rPr>
+        <w:t>Gemini Configuration Service:</w:t>
+      </w:r>
+      <w:r>
+        <w:t xml:space="preserve"> Developed GeminiAiService.java. Maps spring.ai.gemini.api-key and establishes connection templates calling the Gemini API gateway endpoints (gemini-1.5-flash).</w:t>
+      </w:r>
+    </w:p>
+    <w:p>
+      <w:pPr>
+        <w:pStyle w:val="ListBullet"/>
+      </w:pPr>
+      <w:r>
+        <w:rPr>
+          <w:b/>
+        </w:rPr>
+        <w:t>System Instructions &amp; Prompt Engineering:</w:t>
+      </w:r>
+      <w:r>
+        <w:t xml:space="preserve"> Constructed strict prompt formats. Injected student details (current skills, career goals) as variables, instructing the LLM to output structured learning paths in pure JSON format.</w:t>
+      </w:r>
+    </w:p>
+    <w:p>
+      <w:pPr>
+        <w:pStyle w:val="ListBullet"/>
+      </w:pPr>
+      <w:r>
+        <w:rPr>
+          <w:b/>
+        </w:rPr>
+        <w:t>Rate-Limiting &amp; Caching:</w:t>
+      </w:r>
+      <w:r>
+        <w:t xml:space="preserve"> Implemented caching for AI recommendations using Spring's @Cacheable annotation, preventing redundant external API calls and managing rate limits.</w:t>
       </w:r>
     </w:p>
     <w:p/>
@@ -39,7 +76,7 @@
           <w:b/>
           <w:sz w:val="26"/>
         </w:rPr>
-        <w:t>📋 Implementation &amp; Features</w:t>
+        <w:t>2. Skill-Matching Recommendation Engine</w:t>
       </w:r>
     </w:p>
     <w:p>
@@ -50,10 +87,10 @@
         <w:rPr>
           <w:b/>
         </w:rPr>
-        <w:t>Gemini AI Study Buddy Integration:</w:t>
+        <w:t>Matching Algorithm:</w:t>
       </w:r>
       <w:r>
-        <w:t xml:space="preserve"> Configured backend client layer using spring-ai or raw HttpClient calling Gemini API endpoint (gemini-1.5-flash) to generate roadmaps and explanation streams.</w:t>
+        <w:t xml:space="preserve"> Engineered RecommendationService parsing student profile SkillTag lists. Runs matching calculations against requiredSkills profiles from active JobOpportunity tables.</w:t>
       </w:r>
     </w:p>
     <w:p>
@@ -64,10 +101,10 @@
         <w:rPr>
           <w:b/>
         </w:rPr>
-        <w:t>Skill-Matching Recommendation Engine:</w:t>
+        <w:t>Cosine Similarity Calculations:</w:t>
       </w:r>
       <w:r>
-        <w:t xml:space="preserve"> Implemented Cosine Similarity algorithm parsing student profile SkillTag lists and finding matching JobOpportunity requirements.</w:t>
+        <w:t xml:space="preserve"> Calculated vector overlaps based on matching skill indices, returning top matching opportunities above a specific threshold.</w:t>
       </w:r>
     </w:p>
     <w:p>
@@ -78,10 +115,21 @@
         <w:rPr>
           <w:b/>
         </w:rPr>
-        <w:t>Resume Builder Module:</w:t>
+        <w:t>Endpoint Mapping:</w:t>
       </w:r>
       <w:r>
-        <w:t xml:space="preserve"> Integrated JSON-to-PDF resume compiler allowing users to structure resume models and download formatted PDF documents.</w:t>
+        <w:t xml:space="preserve"> Programmed RecommendationController exposing GET /api/recommendations/jobs returning sorted matching positions.</w:t>
+      </w:r>
+    </w:p>
+    <w:p/>
+    <w:p>
+      <w:r>
+        <w:rPr>
+          <w:rFonts w:ascii="Arial" w:hAnsi="Arial"/>
+          <w:b/>
+          <w:sz w:val="26"/>
+        </w:rPr>
+        <w:t>3. Resume Builder &amp; PDF Generation</w:t>
       </w:r>
     </w:p>
     <w:p>
@@ -92,10 +140,38 @@
         <w:rPr>
           <w:b/>
         </w:rPr>
-        <w:t>Coding Arena Compilation Sandbox:</w:t>
+        <w:t>Resume Form Schema:</w:t>
       </w:r>
       <w:r>
-        <w:t xml:space="preserve"> Built execution controller (/api/sandbox/execute) parsing user-submitted code snippets and running matching assertion scripts to test correctness.</w:t>
+        <w:t xml:space="preserve"> Formulated react component ResumeBuilder.jsx gathering education, project metrics, work history, and contact coordinates.</w:t>
+      </w:r>
+    </w:p>
+    <w:p>
+      <w:pPr>
+        <w:pStyle w:val="ListBullet"/>
+      </w:pPr>
+      <w:r>
+        <w:rPr>
+          <w:b/>
+        </w:rPr>
+        <w:t>PDF Document Compiler:</w:t>
+      </w:r>
+      <w:r>
+        <w:t xml:space="preserve"> Integrated printable CSS rules and printing tools allowing students to generate clean A4 templates and export their resume directly as a PDF.</w:t>
+      </w:r>
+    </w:p>
+    <w:p>
+      <w:pPr>
+        <w:pStyle w:val="ListBullet"/>
+      </w:pPr>
+      <w:r>
+        <w:rPr>
+          <w:b/>
+        </w:rPr>
+        <w:t>Profile Sync:</w:t>
+      </w:r>
+      <w:r>
+        <w:t xml:space="preserve"> Added sync methods automatically parsing resume inputs to populate student SkillTag entities inside the database.</w:t>
       </w:r>
     </w:p>
     <w:p/>
@@ -106,7 +182,7 @@
           <w:b/>
           <w:sz w:val="26"/>
         </w:rPr>
-        <w:t>🛠 Deliverables</w:t>
+        <w:t>4. Coding Arena Compilation Sandbox</w:t>
       </w:r>
     </w:p>
     <w:p>
@@ -117,10 +193,10 @@
         <w:rPr>
           <w:b/>
         </w:rPr>
-        <w:t xml:space="preserve">[X] </w:t>
+        <w:t>Code Editor Component:</w:t>
       </w:r>
       <w:r>
-        <w:t>Recommendation controller exposing matched positions under /api/recommendations/jobs.</w:t>
+        <w:t xml:space="preserve"> Configured Monaco Editor (@monaco-editor/react) inside CodingArena.jsx. Supports syntax highlighting and tab indents for Java, JavaScript, and Python.</w:t>
       </w:r>
     </w:p>
     <w:p>
@@ -131,10 +207,10 @@
         <w:rPr>
           <w:b/>
         </w:rPr>
-        <w:t xml:space="preserve">[X] </w:t>
+        <w:t>Compilation REST Endpoint:</w:t>
       </w:r>
       <w:r>
-        <w:t>Resume Builder wizard form with document preview layouts.</w:t>
+        <w:t xml:space="preserve"> Created SandboxController exposing POST /api/sandbox/execute. Takes user code string and runs safety verification checks.</w:t>
       </w:r>
     </w:p>
     <w:p>
@@ -145,10 +221,21 @@
         <w:rPr>
           <w:b/>
         </w:rPr>
-        <w:t xml:space="preserve">[X] </w:t>
+        <w:t>Assertion Runner:</w:t>
       </w:r>
       <w:r>
-        <w:t>Coding Arena text editor module and assertion verification engine.</w:t>
+        <w:t xml:space="preserve"> Programmed sandbox verification logic checking execution returns against preset assert scenarios (e.g. comparing output values with expected test returns).</w:t>
+      </w:r>
+    </w:p>
+    <w:p/>
+    <w:p>
+      <w:r>
+        <w:rPr>
+          <w:rFonts w:ascii="Arial" w:hAnsi="Arial"/>
+          <w:b/>
+          <w:sz w:val="26"/>
+        </w:rPr>
+        <w:t>5. End-to-End System Testing &amp; Verification</w:t>
       </w:r>
     </w:p>
     <w:p>
@@ -159,16 +246,30 @@
         <w:rPr>
           <w:b/>
         </w:rPr>
-        <w:t xml:space="preserve">[X] </w:t>
+        <w:t>JUnit &amp; Mockito Suite:</w:t>
       </w:r>
       <w:r>
-        <w:t>AI study helper chat interface connected to Google Gemini model endpoints.</w:t>
+        <w:t xml:space="preserve"> Programmed backend test cases validating controller endpoints, security filters, and user registration flows.</w:t>
+      </w:r>
+    </w:p>
+    <w:p>
+      <w:pPr>
+        <w:pStyle w:val="ListBullet"/>
+      </w:pPr>
+      <w:r>
+        <w:rPr>
+          <w:b/>
+        </w:rPr>
+        <w:t>Frontend Integration Checks:</w:t>
+      </w:r>
+      <w:r>
+        <w:t xml:space="preserve"> Verified user workflows (Login -&gt; Student Dashboard -&gt; Course Catalog -&gt; Course Enrollment -&gt; Resume Creation -&gt; Matching Job Recommendations).</w:t>
       </w:r>
     </w:p>
     <w:p/>
     <w:sectPr>
       <w:pgSz w:w="12240" w:h="15840"/>
-      <w:pgMar w:top="1440" w:right="1800" w:bottom="1440" w:left="1800" w:header="720" w:footer="720" w:gutter="0"/>
+      <w:pgMar w:top="1440" w:right="1440" w:bottom="1440" w:left="1440" w:header="720" w:footer="720" w:gutter="0"/>
       <w:cols w:space="720"/>
       <w:docGrid w:linePitch="360"/>
     </w:sectPr>
@@ -539,10 +640,6 @@
     <w:name w:val="Normal"/>
     <w:qFormat/>
     <w:rsid w:val="00FC693F"/>
-    <w:rPr>
-      <w:rFonts w:ascii="Arial" w:hAnsi="Arial"/>
-      <w:sz w:val="21"/>
-    </w:rPr>
   </w:style>
   <w:style w:type="paragraph" w:styleId="Header">
     <w:name w:val="header"/>

</xml_diff>

<commit_message>
docs: map all application features across milestones (max 5 pages)
</commit_message>
<xml_diff>
--- a/doc/miles stone 4.docx
+++ b/doc/miles stone 4.docx
@@ -12,7 +12,7 @@
           <w:b/>
           <w:sz w:val="36"/>
         </w:rPr>
-        <w:t>Milestone 4: Advanced AI Features &amp; Application Integrations</w:t>
+        <w:t>Milestone 4: Advanced AI Integrations, Coding Arena &amp; System Validation</w:t>
       </w:r>
     </w:p>
     <w:p/>
@@ -23,7 +23,7 @@
           <w:b/>
           <w:sz w:val="26"/>
         </w:rPr>
-        <w:t>1. Google Gemini AI Integration Layer</w:t>
+        <w:t>1. Implemented Features: Google Gemini AI Integration</w:t>
       </w:r>
     </w:p>
     <w:p>
@@ -37,7 +37,7 @@
         <w:t>Gemini Configuration Service:</w:t>
       </w:r>
       <w:r>
-        <w:t xml:space="preserve"> Developed GeminiAiService.java. Maps spring.ai.gemini.api-key and establishes connection templates calling the Gemini API gateway endpoints (gemini-1.5-flash).</w:t>
+        <w:t xml:space="preserve"> Formulated GeminiAiService.java. Handles connection templates mapping to the Gemini API gateway endpoints (gemini-1.5-flash).</w:t>
       </w:r>
     </w:p>
     <w:p>
@@ -48,10 +48,10 @@
         <w:rPr>
           <w:b/>
         </w:rPr>
-        <w:t>System Instructions &amp; Prompt Engineering:</w:t>
+        <w:t>AI Study Buddy &amp; Assistant:</w:t>
       </w:r>
       <w:r>
-        <w:t xml:space="preserve"> Constructed strict prompt formats. Injected student details (current skills, career goals) as variables, instructing the LLM to output structured learning paths in pure JSON format.</w:t>
+        <w:t xml:space="preserve"> Configured conversational client modules. Explains engineering concepts, maps learning paths, and answers user questions.</w:t>
       </w:r>
     </w:p>
     <w:p>
@@ -62,10 +62,38 @@
         <w:rPr>
           <w:b/>
         </w:rPr>
-        <w:t>Rate-Limiting &amp; Caching:</w:t>
+        <w:t>Personalized Learning Recommendations:</w:t>
       </w:r>
       <w:r>
-        <w:t xml:space="preserve"> Implemented caching for AI recommendations using Spring's @Cacheable annotation, preventing redundant external API calls and managing rate limits.</w:t>
+        <w:t xml:space="preserve"> Implemented algorithms parsing user progress data and matching it with suitable course suggestions.</w:t>
+      </w:r>
+    </w:p>
+    <w:p>
+      <w:pPr>
+        <w:pStyle w:val="ListBullet"/>
+      </w:pPr>
+      <w:r>
+        <w:rPr>
+          <w:b/>
+        </w:rPr>
+        <w:t>AI Career Roadmaps:</w:t>
+      </w:r>
+      <w:r>
+        <w:t xml:space="preserve"> Developed generators outputting step-by-step career path milestones and skill requirements based on career goals.</w:t>
+      </w:r>
+    </w:p>
+    <w:p>
+      <w:pPr>
+        <w:pStyle w:val="ListBullet"/>
+      </w:pPr>
+      <w:r>
+        <w:rPr>
+          <w:b/>
+        </w:rPr>
+        <w:t>AI Resume Suggestions:</w:t>
+      </w:r>
+      <w:r>
+        <w:t xml:space="preserve"> Programmed document verification services reviewing resumes and suggesting optimization adjustments.</w:t>
       </w:r>
     </w:p>
     <w:p/>
@@ -76,7 +104,7 @@
           <w:b/>
           <w:sz w:val="26"/>
         </w:rPr>
-        <w:t>2. Skill-Matching Recommendation Engine</w:t>
+        <w:t>2. Implemented Features: Intelligent Career Matching &amp; Analytics</w:t>
       </w:r>
     </w:p>
     <w:p>
@@ -87,10 +115,10 @@
         <w:rPr>
           <w:b/>
         </w:rPr>
-        <w:t>Matching Algorithm:</w:t>
+        <w:t>Career Recommendation Engine:</w:t>
       </w:r>
       <w:r>
-        <w:t xml:space="preserve"> Engineered RecommendationService parsing student profile SkillTag lists. Runs matching calculations against requiredSkills profiles from active JobOpportunity tables.</w:t>
+        <w:t xml:space="preserve"> Designed algorithms parsing student profiles and calculating matching metrics against active job opportunities.</w:t>
       </w:r>
     </w:p>
     <w:p>
@@ -101,10 +129,10 @@
         <w:rPr>
           <w:b/>
         </w:rPr>
-        <w:t>Cosine Similarity Calculations:</w:t>
+        <w:t>Skill Matching Calculations:</w:t>
       </w:r>
       <w:r>
-        <w:t xml:space="preserve"> Calculated vector overlaps based on matching skill indices, returning top matching opportunities above a specific threshold.</w:t>
+        <w:t xml:space="preserve"> Implemented cosine similarity algorithms comparing student skill vectors with job posting requirements.</w:t>
       </w:r>
     </w:p>
     <w:p>
@@ -115,10 +143,10 @@
         <w:rPr>
           <w:b/>
         </w:rPr>
-        <w:t>Endpoint Mapping:</w:t>
+        <w:t>Smart Progress Insights:</w:t>
       </w:r>
       <w:r>
-        <w:t xml:space="preserve"> Programmed RecommendationController exposing GET /api/recommendations/jobs returning sorted matching positions.</w:t>
+        <w:t xml:space="preserve"> Created analytics modules analyzing study patterns to suggest optimal learning schedules.</w:t>
       </w:r>
     </w:p>
     <w:p/>
@@ -129,7 +157,7 @@
           <w:b/>
           <w:sz w:val="26"/>
         </w:rPr>
-        <w:t>3. Resume Builder &amp; PDF Generation</w:t>
+        <w:t>3. Implemented Features: Resume Builder &amp; Coding Arena Sandbox</w:t>
       </w:r>
     </w:p>
     <w:p>
@@ -140,10 +168,10 @@
         <w:rPr>
           <w:b/>
         </w:rPr>
-        <w:t>Resume Form Schema:</w:t>
+        <w:t>Resume Builder Module:</w:t>
       </w:r>
       <w:r>
-        <w:t xml:space="preserve"> Formulated react component ResumeBuilder.jsx gathering education, project metrics, work history, and contact coordinates.</w:t>
+        <w:t xml:space="preserve"> Programmed form wizard templates gathering career details. Styled printable document formats with PDF download support.</w:t>
       </w:r>
     </w:p>
     <w:p>
@@ -154,10 +182,10 @@
         <w:rPr>
           <w:b/>
         </w:rPr>
-        <w:t>PDF Document Compiler:</w:t>
+        <w:t>Coding Arena UI Layout:</w:t>
       </w:r>
       <w:r>
-        <w:t xml:space="preserve"> Integrated printable CSS rules and printing tools allowing students to generate clean A4 templates and export their resume directly as a PDF.</w:t>
+        <w:t xml:space="preserve"> Integrated Monaco Editor widget supporting themes, syntax highlighting, and auto-formatting options.</w:t>
       </w:r>
     </w:p>
     <w:p>
@@ -168,10 +196,24 @@
         <w:rPr>
           <w:b/>
         </w:rPr>
-        <w:t>Profile Sync:</w:t>
+        <w:t>Compilation Sandbox:</w:t>
       </w:r>
       <w:r>
-        <w:t xml:space="preserve"> Added sync methods automatically parsing resume inputs to populate student SkillTag entities inside the database.</w:t>
+        <w:t xml:space="preserve"> Deployed execute endpoint (/api/sandbox/execute) passing code inputs to safe runners and verifying them against testing parameters.</w:t>
+      </w:r>
+    </w:p>
+    <w:p>
+      <w:pPr>
+        <w:pStyle w:val="ListBullet"/>
+      </w:pPr>
+      <w:r>
+        <w:rPr>
+          <w:b/>
+        </w:rPr>
+        <w:t>Automated Assertion Framework:</w:t>
+      </w:r>
+      <w:r>
+        <w:t xml:space="preserve"> Configured assertion controllers validating execution returns and returning test results to the editor view.</w:t>
       </w:r>
     </w:p>
     <w:p/>
@@ -182,7 +224,7 @@
           <w:b/>
           <w:sz w:val="26"/>
         </w:rPr>
-        <w:t>4. Coding Arena Compilation Sandbox</w:t>
+        <w:t>4. End-to-End System Testing &amp; Deployment</w:t>
       </w:r>
     </w:p>
     <w:p>
@@ -193,10 +235,10 @@
         <w:rPr>
           <w:b/>
         </w:rPr>
-        <w:t>Code Editor Component:</w:t>
+        <w:t>JUnit Testing Suite:</w:t>
       </w:r>
       <w:r>
-        <w:t xml:space="preserve"> Configured Monaco Editor (@monaco-editor/react) inside CodingArena.jsx. Supports syntax highlighting and tab indents for Java, JavaScript, and Python.</w:t>
+        <w:t xml:space="preserve"> Built test cases validating controllers, security filters, and user registration flows.</w:t>
       </w:r>
     </w:p>
     <w:p>
@@ -207,10 +249,10 @@
         <w:rPr>
           <w:b/>
         </w:rPr>
-        <w:t>Compilation REST Endpoint:</w:t>
+        <w:t>Verification Workflows:</w:t>
       </w:r>
       <w:r>
-        <w:t xml:space="preserve"> Created SandboxController exposing POST /api/sandbox/execute. Takes user code string and runs safety verification checks.</w:t>
+        <w:t xml:space="preserve"> Tested integrated workflows (Login -&gt; Student Dashboard -&gt; Course Catalog -&gt; Course Enrollment -&gt; Resume Creation -&gt; Matching Job Recommendations).</w:t>
       </w:r>
     </w:p>
     <w:p>
@@ -221,10 +263,10 @@
         <w:rPr>
           <w:b/>
         </w:rPr>
-        <w:t>Assertion Runner:</w:t>
+        <w:t>Deployment Configuration:</w:t>
       </w:r>
       <w:r>
-        <w:t xml:space="preserve"> Programmed sandbox verification logic checking execution returns against preset assert scenarios (e.g. comparing output values with expected test returns).</w:t>
+        <w:t xml:space="preserve"> Formulated Dockerfile and environment configs for production deployments.</w:t>
       </w:r>
     </w:p>
     <w:p/>
@@ -235,7 +277,7 @@
           <w:b/>
           <w:sz w:val="26"/>
         </w:rPr>
-        <w:t>5. End-to-End System Testing &amp; Verification</w:t>
+        <w:t>5. Deliverables &amp; Technical Verification</w:t>
       </w:r>
     </w:p>
     <w:p>
@@ -246,10 +288,10 @@
         <w:rPr>
           <w:b/>
         </w:rPr>
-        <w:t>JUnit &amp; Mockito Suite:</w:t>
+        <w:t xml:space="preserve">[X] </w:t>
       </w:r>
       <w:r>
-        <w:t xml:space="preserve"> Programmed backend test cases validating controller endpoints, security filters, and user registration flows.</w:t>
+        <w:t>Recommendation controllers returning matched positions under /api/recommendations/jobs.</w:t>
       </w:r>
     </w:p>
     <w:p>
@@ -260,10 +302,38 @@
         <w:rPr>
           <w:b/>
         </w:rPr>
-        <w:t>Frontend Integration Checks:</w:t>
+        <w:t xml:space="preserve">[X] </w:t>
       </w:r>
       <w:r>
-        <w:t xml:space="preserve"> Verified user workflows (Login -&gt; Student Dashboard -&gt; Course Catalog -&gt; Course Enrollment -&gt; Resume Creation -&gt; Matching Job Recommendations).</w:t>
+        <w:t>Resume Builder wizard form with document preview layouts.</w:t>
+      </w:r>
+    </w:p>
+    <w:p>
+      <w:pPr>
+        <w:pStyle w:val="ListBullet"/>
+      </w:pPr>
+      <w:r>
+        <w:rPr>
+          <w:b/>
+        </w:rPr>
+        <w:t xml:space="preserve">[X] </w:t>
+      </w:r>
+      <w:r>
+        <w:t>Coding Arena text editor module and assertion verification engine.</w:t>
+      </w:r>
+    </w:p>
+    <w:p>
+      <w:pPr>
+        <w:pStyle w:val="ListBullet"/>
+      </w:pPr>
+      <w:r>
+        <w:rPr>
+          <w:b/>
+        </w:rPr>
+        <w:t xml:space="preserve">[X] </w:t>
+      </w:r>
+      <w:r>
+        <w:t>AI study helper chat interface connected to Google Gemini model endpoints.</w:t>
       </w:r>
     </w:p>
     <w:p/>

</xml_diff>